<commit_message>
Trim report: drop intro/tech-stack/project-structure, verify schema against code
Removed Introducción, Tecnologías and Estructura del proyecto per
feedback. Confirmed the SQLite schema matches lib/services/db_helper.dart
exactly (kept it, added IF NOT EXISTS to match). Conclusiones shortened
to two one-line bullets.
</commit_message>
<xml_diff>
--- a/Informe_CRUD_SQLite.docx
+++ b/Informe_CRUD_SQLite.docx
@@ -159,7 +159,7 @@
         <w:pStyle w:val="Heading2"/>
       </w:pPr>
       <w:r>
-        <w:t>1. Introducción</w:t>
+        <w:t>1. Esquema de la base de datos (SQLite)</w:t>
       </w:r>
     </w:p>
     <w:p>
@@ -179,143 +179,7 @@
           <w:szCs w:val="24"/>
           <w:lang w:val="es-EC"/>
         </w:rPr>
-        <w:t xml:space="preserve">Este informe documenta el funcionamiento de una aplicación móvil desarrollada en Flutter que implementa un CRUD (Crear, Leer, Actualizar, Eliminar) completo utilizando SQLite como motor de base de datos local. El modelo de datos sigue una relación maestro-detalle: la entidad Marca actúa como maestro y la entidad Modelo como detalle, replicando un caso real de gestión de vehículos (motos y autos), donde cada marca puede tener varios modelos asociados.</w:t>
-      </w:r>
-    </w:p>
-    <w:p>
-      <w:pPr>
-        <w:pStyle w:val="Heading2"/>
-      </w:pPr>
-      <w:r>
-        <w:t>2. Tecnologías utilizadas</w:t>
-      </w:r>
-    </w:p>
-    <w:p>
-      <w:pPr>
-        <w:spacing w:after="200"/>
-        <w:rPr>
-          <w:rFonts w:ascii="Times New Roman" w:hAnsi="Times New Roman" w:cs="Times New Roman"/>
-          <w:sz w:val="24"/>
-          <w:szCs w:val="24"/>
-          <w:lang w:val="es-EC"/>
-        </w:rPr>
-      </w:pPr>
-      <w:r>
-        <w:rPr>
-          <w:rFonts w:ascii="Times New Roman" w:hAnsi="Times New Roman" w:cs="Times New Roman"/>
-          <w:sz w:val="24"/>
-          <w:szCs w:val="24"/>
-          <w:lang w:val="es-EC"/>
-        </w:rPr>
-        <w:t xml:space="preserve">•  Flutter (Dart) — interfaz de usuario multiplataforma (Web, Windows, Android, iOS).</w:t>
-      </w:r>
-    </w:p>
-    <w:p>
-      <w:pPr>
-        <w:spacing w:after="200"/>
-        <w:rPr>
-          <w:rFonts w:ascii="Times New Roman" w:hAnsi="Times New Roman" w:cs="Times New Roman"/>
-          <w:sz w:val="24"/>
-          <w:szCs w:val="24"/>
-          <w:lang w:val="es-EC"/>
-        </w:rPr>
-      </w:pPr>
-      <w:r>
-        <w:rPr>
-          <w:rFonts w:ascii="Times New Roman" w:hAnsi="Times New Roman" w:cs="Times New Roman"/>
-          <w:sz w:val="24"/>
-          <w:szCs w:val="24"/>
-          <w:lang w:val="es-EC"/>
-        </w:rPr>
-        <w:t xml:space="preserve">•  sqflite — API principal de acceso a SQLite (insert, query, update, delete).</w:t>
-      </w:r>
-    </w:p>
-    <w:p>
-      <w:pPr>
-        <w:spacing w:after="200"/>
-        <w:rPr>
-          <w:rFonts w:ascii="Times New Roman" w:hAnsi="Times New Roman" w:cs="Times New Roman"/>
-          <w:sz w:val="24"/>
-          <w:szCs w:val="24"/>
-          <w:lang w:val="es-EC"/>
-        </w:rPr>
-      </w:pPr>
-      <w:r>
-        <w:rPr>
-          <w:rFonts w:ascii="Times New Roman" w:hAnsi="Times New Roman" w:cs="Times New Roman"/>
-          <w:sz w:val="24"/>
-          <w:szCs w:val="24"/>
-          <w:lang w:val="es-EC"/>
-        </w:rPr>
-        <w:t xml:space="preserve">•  sqflite_common_ffi — motor SQLite para escritorio (Windows, Linux, macOS).</w:t>
-      </w:r>
-    </w:p>
-    <w:p>
-      <w:pPr>
-        <w:spacing w:after="200"/>
-        <w:rPr>
-          <w:rFonts w:ascii="Times New Roman" w:hAnsi="Times New Roman" w:cs="Times New Roman"/>
-          <w:sz w:val="24"/>
-          <w:szCs w:val="24"/>
-          <w:lang w:val="es-EC"/>
-        </w:rPr>
-      </w:pPr>
-      <w:r>
-        <w:rPr>
-          <w:rFonts w:ascii="Times New Roman" w:hAnsi="Times New Roman" w:cs="Times New Roman"/>
-          <w:sz w:val="24"/>
-          <w:szCs w:val="24"/>
-          <w:lang w:val="es-EC"/>
-        </w:rPr>
-        <w:t xml:space="preserve">•  sqflite_common_ffi_web — motor SQLite compilado a WebAssembly, para ejecutar la app en el navegador.</w:t>
-      </w:r>
-    </w:p>
-    <w:p>
-      <w:pPr>
-        <w:spacing w:after="200"/>
-        <w:rPr>
-          <w:rFonts w:ascii="Times New Roman" w:hAnsi="Times New Roman" w:cs="Times New Roman"/>
-          <w:sz w:val="24"/>
-          <w:szCs w:val="24"/>
-          <w:lang w:val="es-EC"/>
-        </w:rPr>
-      </w:pPr>
-      <w:r>
-        <w:rPr>
-          <w:rFonts w:ascii="Times New Roman" w:hAnsi="Times New Roman" w:cs="Times New Roman"/>
-          <w:sz w:val="24"/>
-          <w:szCs w:val="24"/>
-          <w:lang w:val="es-EC"/>
-        </w:rPr>
-        <w:t xml:space="preserve">•  path — construcción de rutas de archivo multiplataforma.</w:t>
-      </w:r>
-    </w:p>
-    <w:p>
-      <w:pPr>
-        <w:pStyle w:val="Heading2"/>
-      </w:pPr>
-      <w:r>
-        <w:t>3. Modelo de datos (esquema SQLite)</w:t>
-      </w:r>
-    </w:p>
-    <w:p>
-      <w:pPr>
-        <w:spacing w:after="200"/>
-        <w:rPr>
-          <w:rFonts w:ascii="Times New Roman" w:hAnsi="Times New Roman" w:cs="Times New Roman"/>
-          <w:sz w:val="24"/>
-          <w:szCs w:val="24"/>
-          <w:lang w:val="es-EC"/>
-        </w:rPr>
-      </w:pPr>
-      <w:r>
-        <w:rPr>
-          <w:rFonts w:ascii="Times New Roman" w:hAnsi="Times New Roman" w:cs="Times New Roman"/>
-          <w:sz w:val="24"/>
-          <w:szCs w:val="24"/>
-          <w:lang w:val="es-EC"/>
-        </w:rPr>
-        <w:t xml:space="preserve">La base de datos contiene dos tablas relacionadas por una llave foránea con eliminación en cascada: al eliminar una marca, se eliminan automáticamente todos sus modelos asociados.</w:t>
+        <w:t xml:space="preserve">La base de datos contiene dos tablas relacionadas por una llave foránea con eliminación en cascada: al eliminar una marca, se eliminan automáticamente todos sus modelos asociados. Tomado tal cual de lib/services/db_helper.dart:</w:t>
       </w:r>
     </w:p>
     <w:p>
@@ -334,7 +198,7 @@
           <w:sz w:val="18"/>
           <w:szCs w:val="18"/>
         </w:rPr>
-        <w:t xml:space="preserve">CREATE TABLE marcas (</w:t>
+        <w:t xml:space="preserve">CREATE TABLE IF NOT EXISTS marcas (</w:t>
       </w:r>
     </w:p>
     <w:p>
@@ -410,7 +274,7 @@
           <w:sz w:val="18"/>
           <w:szCs w:val="18"/>
         </w:rPr>
-        <w:t xml:space="preserve">);</w:t>
+        <w:t xml:space="preserve">)</w:t>
       </w:r>
     </w:p>
     <w:p>
@@ -448,7 +312,7 @@
           <w:sz w:val="18"/>
           <w:szCs w:val="18"/>
         </w:rPr>
-        <w:t xml:space="preserve">CREATE TABLE modelos (</w:t>
+        <w:t xml:space="preserve">CREATE TABLE IF NOT EXISTS modelos (</w:t>
       </w:r>
     </w:p>
     <w:p>
@@ -600,7 +464,7 @@
           <w:sz w:val="18"/>
           <w:szCs w:val="18"/>
         </w:rPr>
-        <w:t xml:space="preserve">);</w:t>
+        <w:t xml:space="preserve">)</w:t>
       </w:r>
     </w:p>
     <w:p>
@@ -608,83 +472,15 @@
         <w:pStyle w:val="Heading2"/>
       </w:pPr>
       <w:r>
-        <w:t>4. Estructura del proyecto</w:t>
+        <w:t>2. Funcionamiento de la aplicación móvil</w:t>
       </w:r>
     </w:p>
     <w:p>
       <w:pPr>
-        <w:spacing w:after="200"/>
-        <w:rPr>
-          <w:rFonts w:ascii="Times New Roman" w:hAnsi="Times New Roman" w:cs="Times New Roman"/>
-          <w:sz w:val="24"/>
-          <w:szCs w:val="24"/>
-          <w:lang w:val="es-EC"/>
-        </w:rPr>
-      </w:pPr>
-      <w:r>
-        <w:rPr>
-          <w:rFonts w:ascii="Times New Roman" w:hAnsi="Times New Roman" w:cs="Times New Roman"/>
-          <w:sz w:val="24"/>
-          <w:szCs w:val="24"/>
-          <w:lang w:val="es-EC"/>
-        </w:rPr>
-        <w:t xml:space="preserve">•  models/ — clases Marca y Modelo con toMap()/fromMap() para mapear filas SQLite.</w:t>
-      </w:r>
-    </w:p>
-    <w:p>
-      <w:pPr>
-        <w:spacing w:after="200"/>
-        <w:rPr>
-          <w:rFonts w:ascii="Times New Roman" w:hAnsi="Times New Roman" w:cs="Times New Roman"/>
-          <w:sz w:val="24"/>
-          <w:szCs w:val="24"/>
-          <w:lang w:val="es-EC"/>
-        </w:rPr>
-      </w:pPr>
-      <w:r>
-        <w:rPr>
-          <w:rFonts w:ascii="Times New Roman" w:hAnsi="Times New Roman" w:cs="Times New Roman"/>
-          <w:sz w:val="24"/>
-          <w:szCs w:val="24"/>
-          <w:lang w:val="es-EC"/>
-        </w:rPr>
-        <w:t xml:space="preserve">•  services/ — db_helper.dart (conexión y migraciones) y los servicios CRUD (marca_service.dart, modelo_service.dart).</w:t>
-      </w:r>
-    </w:p>
-    <w:p>
-      <w:pPr>
-        <w:spacing w:after="200"/>
-        <w:rPr>
-          <w:rFonts w:ascii="Times New Roman" w:hAnsi="Times New Roman" w:cs="Times New Roman"/>
-          <w:sz w:val="24"/>
-          <w:szCs w:val="24"/>
-          <w:lang w:val="es-EC"/>
-        </w:rPr>
-      </w:pPr>
-      <w:r>
-        <w:rPr>
-          <w:rFonts w:ascii="Times New Roman" w:hAnsi="Times New Roman" w:cs="Times New Roman"/>
-          <w:sz w:val="24"/>
-          <w:szCs w:val="24"/>
-          <w:lang w:val="es-EC"/>
-        </w:rPr>
-        <w:t xml:space="preserve">•  pages/ — pantallas de lista y formulario para cada entidad (marca_list, marca_form, modelo_list, modelo_form).</w:t>
-      </w:r>
-    </w:p>
-    <w:p>
-      <w:pPr>
-        <w:pStyle w:val="Heading2"/>
-      </w:pPr>
-      <w:r>
-        <w:t>5. Funcionamiento de la aplicación móvil</w:t>
-      </w:r>
-    </w:p>
-    <w:p>
-      <w:pPr>
         <w:pStyle w:val="Heading3"/>
       </w:pPr>
       <w:r>
-        <w:t>5.1 Crear</w:t>
+        <w:t>2.1 Crear</w:t>
       </w:r>
     </w:p>
     <w:p>
@@ -818,7 +614,7 @@
         <w:pStyle w:val="Heading3"/>
       </w:pPr>
       <w:r>
-        <w:t>5.2 Leer</w:t>
+        <w:t>2.2 Leer</w:t>
       </w:r>
     </w:p>
     <w:p>
@@ -952,7 +748,7 @@
         <w:pStyle w:val="Heading3"/>
       </w:pPr>
       <w:r>
-        <w:t>5.3 Actualizar</w:t>
+        <w:t>2.3 Actualizar</w:t>
       </w:r>
     </w:p>
     <w:p>
@@ -1023,7 +819,7 @@
         <w:pStyle w:val="Heading3"/>
       </w:pPr>
       <w:r>
-        <w:t>5.4 Eliminar</w:t>
+        <w:t>2.4 Eliminar</w:t>
       </w:r>
     </w:p>
     <w:p>
@@ -1094,7 +890,7 @@
         <w:pStyle w:val="Heading2"/>
       </w:pPr>
       <w:r>
-        <w:t>6. Conclusiones</w:t>
+        <w:t>3. Conclusiones</w:t>
       </w:r>
     </w:p>
     <w:p>
@@ -1114,7 +910,27 @@
           <w:szCs w:val="24"/>
           <w:lang w:val="es-EC"/>
         </w:rPr>
-        <w:t xml:space="preserve">El uso de SQLite permite que la aplicación funcione completamente sin conexión a internet, manteniendo la integridad referencial entre marcas y modelos mediante llaves foráneas. La separación en capas (modelos, servicios y pantallas) facilita el mantenimiento y la extensión de la aplicación a futuro.</w:t>
+        <w:t xml:space="preserve">•  SQLite permite que la app funcione sin conexión a internet.</w:t>
+      </w:r>
+    </w:p>
+    <w:p>
+      <w:pPr>
+        <w:spacing w:after="200"/>
+        <w:rPr>
+          <w:rFonts w:ascii="Times New Roman" w:hAnsi="Times New Roman" w:cs="Times New Roman"/>
+          <w:sz w:val="24"/>
+          <w:szCs w:val="24"/>
+          <w:lang w:val="es-EC"/>
+        </w:rPr>
+      </w:pPr>
+      <w:r>
+        <w:rPr>
+          <w:rFonts w:ascii="Times New Roman" w:hAnsi="Times New Roman" w:cs="Times New Roman"/>
+          <w:sz w:val="24"/>
+          <w:szCs w:val="24"/>
+          <w:lang w:val="es-EC"/>
+        </w:rPr>
+        <w:t xml:space="preserve">•  La llave foránea con ON DELETE CASCADE mantiene íntegra la relación maestro-detalle.</w:t>
       </w:r>
     </w:p>
     <w:sectPr>

</xml_diff>